<commit_message>
Correction of final things
</commit_message>
<xml_diff>
--- a/מסמך אפיון מערכת לניהול קריאות חירום ומתנדבים (שוחזר אוטומטית).docx
+++ b/מסמך אפיון מערכת לניהול קריאות חירום ומתנדבים (שוחזר אוטומטית).docx
@@ -2349,41 +2349,6 @@
           <w:rtl/>
         </w:rPr>
         <w:t>המערכת תומכת במספר מוגבל של מתנדבים (עד 20 לקריאה) לשמירה על יעילות.</w:t>
-      </w:r>
-    </w:p>
-    <w:p>
-      <w:pPr>
-        <w:numPr>
-          <w:ilvl w:val="0"/>
-          <w:numId w:val="12"/>
-        </w:numPr>
-        <w:rPr>
-          <w:rtl/>
-        </w:rPr>
-      </w:pPr>
-      <w:r>
-        <w:rPr>
-          <w:rtl/>
-        </w:rPr>
-        <w:t xml:space="preserve">חישוב המרחק הוא </w:t>
-      </w:r>
-      <w:r>
-        <w:t>Euclidean</w:t>
-      </w:r>
-      <w:r>
-        <w:rPr>
-          <w:rtl/>
-        </w:rPr>
-        <w:t xml:space="preserve"> פשוט; ניתן לשדרג לחישוב מדויק יותר (כמו </w:t>
-      </w:r>
-      <w:r>
-        <w:t>Haversine</w:t>
-      </w:r>
-      <w:r>
-        <w:rPr>
-          <w:rtl/>
-        </w:rPr>
-        <w:t>).</w:t>
       </w:r>
     </w:p>
     <w:p>

</xml_diff>